<commit_message>
data processing added and report updated
</commit_message>
<xml_diff>
--- a/reports/Rapport_DS_Analyse_de_radiographies_pulmonaires_Covid-19_v1.docx
+++ b/reports/Rapport_DS_Analyse_de_radiographies_pulmonaires_Covid-19_v1.docx
@@ -334,7 +334,7 @@
           <w:r>
             <w:fldChar w:fldCharType="separate"/>
           </w:r>
-          <w:hyperlink w:anchor="_Toc229495732" w:history="1">
+          <w:hyperlink w:anchor="_Toc229755570" w:history="1">
             <w:r>
               <w:rPr>
                 <w:rStyle w:val="Lienhypertexte"/>
@@ -376,7 +376,7 @@
                 <w:noProof/>
                 <w:webHidden/>
               </w:rPr>
-              <w:instrText xml:space="preserve"> PAGEREF _Toc229495732 \h </w:instrText>
+              <w:instrText xml:space="preserve"> PAGEREF _Toc229755570 \h </w:instrText>
             </w:r>
             <w:r>
               <w:rPr>
@@ -420,7 +420,7 @@
               <w:lang w:eastAsia="fr-FR"/>
             </w:rPr>
           </w:pPr>
-          <w:hyperlink w:anchor="_Toc229495733" w:history="1">
+          <w:hyperlink w:anchor="_Toc229755571" w:history="1">
             <w:r>
               <w:rPr>
                 <w:rStyle w:val="Lienhypertexte"/>
@@ -462,7 +462,7 @@
                 <w:noProof/>
                 <w:webHidden/>
               </w:rPr>
-              <w:instrText xml:space="preserve"> PAGEREF _Toc229495733 \h </w:instrText>
+              <w:instrText xml:space="preserve"> PAGEREF _Toc229755571 \h </w:instrText>
             </w:r>
             <w:r>
               <w:rPr>
@@ -506,7 +506,7 @@
               <w:lang w:eastAsia="fr-FR"/>
             </w:rPr>
           </w:pPr>
-          <w:hyperlink w:anchor="_Toc229495734" w:history="1">
+          <w:hyperlink w:anchor="_Toc229755572" w:history="1">
             <w:r>
               <w:rPr>
                 <w:rStyle w:val="Lienhypertexte"/>
@@ -548,7 +548,7 @@
                 <w:noProof/>
                 <w:webHidden/>
               </w:rPr>
-              <w:instrText xml:space="preserve"> PAGEREF _Toc229495734 \h </w:instrText>
+              <w:instrText xml:space="preserve"> PAGEREF _Toc229755572 \h </w:instrText>
             </w:r>
             <w:r>
               <w:rPr>
@@ -592,7 +592,7 @@
               <w:lang w:eastAsia="fr-FR"/>
             </w:rPr>
           </w:pPr>
-          <w:hyperlink w:anchor="_Toc229495735" w:history="1">
+          <w:hyperlink w:anchor="_Toc229755573" w:history="1">
             <w:r>
               <w:rPr>
                 <w:rStyle w:val="Lienhypertexte"/>
@@ -634,7 +634,7 @@
                 <w:noProof/>
                 <w:webHidden/>
               </w:rPr>
-              <w:instrText xml:space="preserve"> PAGEREF _Toc229495735 \h </w:instrText>
+              <w:instrText xml:space="preserve"> PAGEREF _Toc229755573 \h </w:instrText>
             </w:r>
             <w:r>
               <w:rPr>
@@ -678,7 +678,7 @@
               <w:lang w:eastAsia="fr-FR"/>
             </w:rPr>
           </w:pPr>
-          <w:hyperlink w:anchor="_Toc229495736" w:history="1">
+          <w:hyperlink w:anchor="_Toc229755574" w:history="1">
             <w:r>
               <w:rPr>
                 <w:rStyle w:val="Lienhypertexte"/>
@@ -720,7 +720,7 @@
                 <w:noProof/>
                 <w:webHidden/>
               </w:rPr>
-              <w:instrText xml:space="preserve"> PAGEREF _Toc229495736 \h </w:instrText>
+              <w:instrText xml:space="preserve"> PAGEREF _Toc229755574 \h </w:instrText>
             </w:r>
             <w:r>
               <w:rPr>
@@ -764,7 +764,7 @@
               <w:lang w:eastAsia="fr-FR"/>
             </w:rPr>
           </w:pPr>
-          <w:hyperlink w:anchor="_Toc229495737" w:history="1">
+          <w:hyperlink w:anchor="_Toc229755575" w:history="1">
             <w:r>
               <w:rPr>
                 <w:rStyle w:val="Lienhypertexte"/>
@@ -806,7 +806,7 @@
                 <w:noProof/>
                 <w:webHidden/>
               </w:rPr>
-              <w:instrText xml:space="preserve"> PAGEREF _Toc229495737 \h </w:instrText>
+              <w:instrText xml:space="preserve"> PAGEREF _Toc229755575 \h </w:instrText>
             </w:r>
             <w:r>
               <w:rPr>
@@ -850,7 +850,7 @@
               <w:lang w:eastAsia="fr-FR"/>
             </w:rPr>
           </w:pPr>
-          <w:hyperlink w:anchor="_Toc229495738" w:history="1">
+          <w:hyperlink w:anchor="_Toc229755576" w:history="1">
             <w:r>
               <w:rPr>
                 <w:rStyle w:val="Lienhypertexte"/>
@@ -892,7 +892,7 @@
                 <w:noProof/>
                 <w:webHidden/>
               </w:rPr>
-              <w:instrText xml:space="preserve"> PAGEREF _Toc229495738 \h </w:instrText>
+              <w:instrText xml:space="preserve"> PAGEREF _Toc229755576 \h </w:instrText>
             </w:r>
             <w:r>
               <w:rPr>
@@ -936,7 +936,7 @@
               <w:lang w:eastAsia="fr-FR"/>
             </w:rPr>
           </w:pPr>
-          <w:hyperlink w:anchor="_Toc229495739" w:history="1">
+          <w:hyperlink w:anchor="_Toc229755577" w:history="1">
             <w:r>
               <w:rPr>
                 <w:rStyle w:val="Lienhypertexte"/>
@@ -978,7 +978,7 @@
                 <w:noProof/>
                 <w:webHidden/>
               </w:rPr>
-              <w:instrText xml:space="preserve"> PAGEREF _Toc229495739 \h </w:instrText>
+              <w:instrText xml:space="preserve"> PAGEREF _Toc229755577 \h </w:instrText>
             </w:r>
             <w:r>
               <w:rPr>
@@ -1022,7 +1022,7 @@
               <w:lang w:eastAsia="fr-FR"/>
             </w:rPr>
           </w:pPr>
-          <w:hyperlink w:anchor="_Toc229495740" w:history="1">
+          <w:hyperlink w:anchor="_Toc229755578" w:history="1">
             <w:r>
               <w:rPr>
                 <w:rStyle w:val="Lienhypertexte"/>
@@ -1064,7 +1064,7 @@
                 <w:noProof/>
                 <w:webHidden/>
               </w:rPr>
-              <w:instrText xml:space="preserve"> PAGEREF _Toc229495740 \h </w:instrText>
+              <w:instrText xml:space="preserve"> PAGEREF _Toc229755578 \h </w:instrText>
             </w:r>
             <w:r>
               <w:rPr>
@@ -1108,7 +1108,7 @@
               <w:lang w:eastAsia="fr-FR"/>
             </w:rPr>
           </w:pPr>
-          <w:hyperlink w:anchor="_Toc229495741" w:history="1">
+          <w:hyperlink w:anchor="_Toc229755579" w:history="1">
             <w:r>
               <w:rPr>
                 <w:rStyle w:val="Lienhypertexte"/>
@@ -1150,7 +1150,7 @@
                 <w:noProof/>
                 <w:webHidden/>
               </w:rPr>
-              <w:instrText xml:space="preserve"> PAGEREF _Toc229495741 \h </w:instrText>
+              <w:instrText xml:space="preserve"> PAGEREF _Toc229755579 \h </w:instrText>
             </w:r>
             <w:r>
               <w:rPr>
@@ -1194,7 +1194,7 @@
               <w:lang w:eastAsia="fr-FR"/>
             </w:rPr>
           </w:pPr>
-          <w:hyperlink w:anchor="_Toc229495742" w:history="1">
+          <w:hyperlink w:anchor="_Toc229755580" w:history="1">
             <w:r>
               <w:rPr>
                 <w:rStyle w:val="Lienhypertexte"/>
@@ -1236,7 +1236,7 @@
                 <w:noProof/>
                 <w:webHidden/>
               </w:rPr>
-              <w:instrText xml:space="preserve"> PAGEREF _Toc229495742 \h </w:instrText>
+              <w:instrText xml:space="preserve"> PAGEREF _Toc229755580 \h </w:instrText>
             </w:r>
             <w:r>
               <w:rPr>
@@ -1280,7 +1280,7 @@
               <w:lang w:eastAsia="fr-FR"/>
             </w:rPr>
           </w:pPr>
-          <w:hyperlink w:anchor="_Toc229495743" w:history="1">
+          <w:hyperlink w:anchor="_Toc229755581" w:history="1">
             <w:r>
               <w:rPr>
                 <w:rStyle w:val="Lienhypertexte"/>
@@ -1322,7 +1322,7 @@
                 <w:noProof/>
                 <w:webHidden/>
               </w:rPr>
-              <w:instrText xml:space="preserve"> PAGEREF _Toc229495743 \h </w:instrText>
+              <w:instrText xml:space="preserve"> PAGEREF _Toc229755581 \h </w:instrText>
             </w:r>
             <w:r>
               <w:rPr>
@@ -1405,7 +1405,7 @@
         </w:rPr>
         <w:fldChar w:fldCharType="separate"/>
       </w:r>
-      <w:hyperlink w:anchor="_Toc229495744" w:history="1">
+      <w:hyperlink w:anchor="_Toc229755582" w:history="1">
         <w:r>
           <w:rPr>
             <w:rStyle w:val="Lienhypertexte"/>
@@ -1432,7 +1432,7 @@
             <w:noProof/>
             <w:webHidden/>
           </w:rPr>
-          <w:instrText xml:space="preserve"> PAGEREF _Toc229495744 \h </w:instrText>
+          <w:instrText xml:space="preserve"> PAGEREF _Toc229755582 \h </w:instrText>
         </w:r>
         <w:r>
           <w:rPr>
@@ -1475,7 +1475,7 @@
           <w:lang w:eastAsia="fr-FR"/>
         </w:rPr>
       </w:pPr>
-      <w:hyperlink w:anchor="_Toc229495745" w:history="1">
+      <w:hyperlink w:anchor="_Toc229755583" w:history="1">
         <w:r>
           <w:rPr>
             <w:rStyle w:val="Lienhypertexte"/>
@@ -1502,7 +1502,7 @@
             <w:noProof/>
             <w:webHidden/>
           </w:rPr>
-          <w:instrText xml:space="preserve"> PAGEREF _Toc229495745 \h </w:instrText>
+          <w:instrText xml:space="preserve"> PAGEREF _Toc229755583 \h </w:instrText>
         </w:r>
         <w:r>
           <w:rPr>
@@ -1545,7 +1545,7 @@
           <w:lang w:eastAsia="fr-FR"/>
         </w:rPr>
       </w:pPr>
-      <w:hyperlink w:anchor="_Toc229495746" w:history="1">
+      <w:hyperlink w:anchor="_Toc229755584" w:history="1">
         <w:r>
           <w:rPr>
             <w:rStyle w:val="Lienhypertexte"/>
@@ -1572,7 +1572,7 @@
             <w:noProof/>
             <w:webHidden/>
           </w:rPr>
-          <w:instrText xml:space="preserve"> PAGEREF _Toc229495746 \h </w:instrText>
+          <w:instrText xml:space="preserve"> PAGEREF _Toc229755584 \h </w:instrText>
         </w:r>
         <w:r>
           <w:rPr>
@@ -1615,7 +1615,7 @@
           <w:lang w:eastAsia="fr-FR"/>
         </w:rPr>
       </w:pPr>
-      <w:hyperlink w:anchor="_Toc229495747" w:history="1">
+      <w:hyperlink w:anchor="_Toc229755585" w:history="1">
         <w:r>
           <w:rPr>
             <w:rStyle w:val="Lienhypertexte"/>
@@ -1642,7 +1642,7 @@
             <w:noProof/>
             <w:webHidden/>
           </w:rPr>
-          <w:instrText xml:space="preserve"> PAGEREF _Toc229495747 \h </w:instrText>
+          <w:instrText xml:space="preserve"> PAGEREF _Toc229755585 \h </w:instrText>
         </w:r>
         <w:r>
           <w:rPr>
@@ -1685,7 +1685,7 @@
           <w:lang w:eastAsia="fr-FR"/>
         </w:rPr>
       </w:pPr>
-      <w:hyperlink w:anchor="_Toc229495748" w:history="1">
+      <w:hyperlink w:anchor="_Toc229755586" w:history="1">
         <w:r>
           <w:rPr>
             <w:rStyle w:val="Lienhypertexte"/>
@@ -1712,7 +1712,7 @@
             <w:noProof/>
             <w:webHidden/>
           </w:rPr>
-          <w:instrText xml:space="preserve"> PAGEREF _Toc229495748 \h </w:instrText>
+          <w:instrText xml:space="preserve"> PAGEREF _Toc229755586 \h </w:instrText>
         </w:r>
         <w:r>
           <w:rPr>
@@ -1755,7 +1755,7 @@
           <w:lang w:eastAsia="fr-FR"/>
         </w:rPr>
       </w:pPr>
-      <w:hyperlink w:anchor="_Toc229495749" w:history="1">
+      <w:hyperlink w:anchor="_Toc229755587" w:history="1">
         <w:r>
           <w:rPr>
             <w:rStyle w:val="Lienhypertexte"/>
@@ -1782,7 +1782,7 @@
             <w:noProof/>
             <w:webHidden/>
           </w:rPr>
-          <w:instrText xml:space="preserve"> PAGEREF _Toc229495749 \h </w:instrText>
+          <w:instrText xml:space="preserve"> PAGEREF _Toc229755587 \h </w:instrText>
         </w:r>
         <w:r>
           <w:rPr>
@@ -1825,7 +1825,7 @@
           <w:lang w:eastAsia="fr-FR"/>
         </w:rPr>
       </w:pPr>
-      <w:hyperlink w:anchor="_Toc229495750" w:history="1">
+      <w:hyperlink w:anchor="_Toc229755588" w:history="1">
         <w:r>
           <w:rPr>
             <w:rStyle w:val="Lienhypertexte"/>
@@ -1852,7 +1852,7 @@
             <w:noProof/>
             <w:webHidden/>
           </w:rPr>
-          <w:instrText xml:space="preserve"> PAGEREF _Toc229495750 \h </w:instrText>
+          <w:instrText xml:space="preserve"> PAGEREF _Toc229755588 \h </w:instrText>
         </w:r>
         <w:r>
           <w:rPr>
@@ -1895,7 +1895,7 @@
           <w:lang w:eastAsia="fr-FR"/>
         </w:rPr>
       </w:pPr>
-      <w:hyperlink w:anchor="_Toc229495751" w:history="1">
+      <w:hyperlink w:anchor="_Toc229755589" w:history="1">
         <w:r>
           <w:rPr>
             <w:rStyle w:val="Lienhypertexte"/>
@@ -1922,7 +1922,7 @@
             <w:noProof/>
             <w:webHidden/>
           </w:rPr>
-          <w:instrText xml:space="preserve"> PAGEREF _Toc229495751 \h </w:instrText>
+          <w:instrText xml:space="preserve"> PAGEREF _Toc229755589 \h </w:instrText>
         </w:r>
         <w:r>
           <w:rPr>
@@ -1965,7 +1965,7 @@
           <w:lang w:eastAsia="fr-FR"/>
         </w:rPr>
       </w:pPr>
-      <w:hyperlink w:anchor="_Toc229495752" w:history="1">
+      <w:hyperlink w:anchor="_Toc229755590" w:history="1">
         <w:r>
           <w:rPr>
             <w:rStyle w:val="Lienhypertexte"/>
@@ -1992,7 +1992,7 @@
             <w:noProof/>
             <w:webHidden/>
           </w:rPr>
-          <w:instrText xml:space="preserve"> PAGEREF _Toc229495752 \h </w:instrText>
+          <w:instrText xml:space="preserve"> PAGEREF _Toc229755590 \h </w:instrText>
         </w:r>
         <w:r>
           <w:rPr>
@@ -2035,7 +2035,7 @@
           <w:lang w:eastAsia="fr-FR"/>
         </w:rPr>
       </w:pPr>
-      <w:hyperlink w:anchor="_Toc229495753" w:history="1">
+      <w:hyperlink w:anchor="_Toc229755591" w:history="1">
         <w:r>
           <w:rPr>
             <w:rStyle w:val="Lienhypertexte"/>
@@ -2062,7 +2062,7 @@
             <w:noProof/>
             <w:webHidden/>
           </w:rPr>
-          <w:instrText xml:space="preserve"> PAGEREF _Toc229495753 \h </w:instrText>
+          <w:instrText xml:space="preserve"> PAGEREF _Toc229755591 \h </w:instrText>
         </w:r>
         <w:r>
           <w:rPr>
@@ -2105,7 +2105,7 @@
           <w:lang w:eastAsia="fr-FR"/>
         </w:rPr>
       </w:pPr>
-      <w:hyperlink w:anchor="_Toc229495754" w:history="1">
+      <w:hyperlink w:anchor="_Toc229755592" w:history="1">
         <w:r>
           <w:rPr>
             <w:rStyle w:val="Lienhypertexte"/>
@@ -2132,7 +2132,7 @@
             <w:noProof/>
             <w:webHidden/>
           </w:rPr>
-          <w:instrText xml:space="preserve"> PAGEREF _Toc229495754 \h </w:instrText>
+          <w:instrText xml:space="preserve"> PAGEREF _Toc229755592 \h </w:instrText>
         </w:r>
         <w:r>
           <w:rPr>
@@ -2153,6 +2153,76 @@
             <w:webHidden/>
           </w:rPr>
           <w:t>13</w:t>
+        </w:r>
+        <w:r>
+          <w:rPr>
+            <w:noProof/>
+            <w:webHidden/>
+          </w:rPr>
+          <w:fldChar w:fldCharType="end"/>
+        </w:r>
+      </w:hyperlink>
+    </w:p>
+    <w:p>
+      <w:pPr>
+        <w:pStyle w:val="Tabledesillustrations"/>
+        <w:tabs>
+          <w:tab w:val="right" w:leader="dot" w:pos="9062"/>
+        </w:tabs>
+        <w:rPr>
+          <w:rFonts w:eastAsiaTheme="minorEastAsia"/>
+          <w:noProof/>
+          <w:lang w:eastAsia="fr-FR"/>
+        </w:rPr>
+      </w:pPr>
+      <w:hyperlink w:anchor="_Toc229755593" w:history="1">
+        <w:r>
+          <w:rPr>
+            <w:rStyle w:val="Lienhypertexte"/>
+            <w:noProof/>
+          </w:rPr>
+          <w:t>Figure 12: Echantillon de données pré-traitées</w:t>
+        </w:r>
+        <w:r>
+          <w:rPr>
+            <w:noProof/>
+            <w:webHidden/>
+          </w:rPr>
+          <w:tab/>
+        </w:r>
+        <w:r>
+          <w:rPr>
+            <w:noProof/>
+            <w:webHidden/>
+          </w:rPr>
+          <w:fldChar w:fldCharType="begin"/>
+        </w:r>
+        <w:r>
+          <w:rPr>
+            <w:noProof/>
+            <w:webHidden/>
+          </w:rPr>
+          <w:instrText xml:space="preserve"> PAGEREF _Toc229755593 \h </w:instrText>
+        </w:r>
+        <w:r>
+          <w:rPr>
+            <w:noProof/>
+            <w:webHidden/>
+          </w:rPr>
+        </w:r>
+        <w:r>
+          <w:rPr>
+            <w:noProof/>
+            <w:webHidden/>
+          </w:rPr>
+          <w:fldChar w:fldCharType="separate"/>
+        </w:r>
+        <w:r>
+          <w:rPr>
+            <w:noProof/>
+            <w:webHidden/>
+          </w:rPr>
+          <w:t>14</w:t>
         </w:r>
         <w:r>
           <w:rPr>
@@ -2193,7 +2263,7 @@
           <w:numId w:val="2"/>
         </w:numPr>
       </w:pPr>
-      <w:bookmarkStart w:id="0" w:name="_Toc229495732"/>
+      <w:bookmarkStart w:id="0" w:name="_Toc229755570"/>
       <w:r>
         <w:lastRenderedPageBreak/>
         <w:t>Introduction</w:t>
@@ -2208,7 +2278,7 @@
           <w:numId w:val="2"/>
         </w:numPr>
       </w:pPr>
-      <w:bookmarkStart w:id="1" w:name="_Toc229495733"/>
+      <w:bookmarkStart w:id="1" w:name="_Toc229755571"/>
       <w:r>
         <w:t>Contexte</w:t>
       </w:r>
@@ -2246,7 +2316,7 @@
           <w:numId w:val="2"/>
         </w:numPr>
       </w:pPr>
-      <w:bookmarkStart w:id="2" w:name="_Toc229495734"/>
+      <w:bookmarkStart w:id="2" w:name="_Toc229755572"/>
       <w:r>
         <w:t>Périmètre</w:t>
       </w:r>
@@ -2374,7 +2444,7 @@
           <w:numId w:val="2"/>
         </w:numPr>
       </w:pPr>
-      <w:bookmarkStart w:id="3" w:name="_Toc229495735"/>
+      <w:bookmarkStart w:id="3" w:name="_Toc229755573"/>
       <w:r>
         <w:t>Objectif</w:t>
       </w:r>
@@ -2422,7 +2492,7 @@
           <w:numId w:val="2"/>
         </w:numPr>
       </w:pPr>
-      <w:bookmarkStart w:id="4" w:name="_Toc229495736"/>
+      <w:bookmarkStart w:id="4" w:name="_Toc229755574"/>
       <w:r>
         <w:t>Exploration des données</w:t>
       </w:r>
@@ -2849,7 +2919,7 @@
           <w:numId w:val="2"/>
         </w:numPr>
       </w:pPr>
-      <w:bookmarkStart w:id="5" w:name="_Toc229495737"/>
+      <w:bookmarkStart w:id="5" w:name="_Toc229755575"/>
       <w:r>
         <w:t>V</w:t>
       </w:r>
@@ -2866,7 +2936,7 @@
           <w:numId w:val="2"/>
         </w:numPr>
       </w:pPr>
-      <w:bookmarkStart w:id="6" w:name="_Toc229495738"/>
+      <w:bookmarkStart w:id="6" w:name="_Toc229755576"/>
       <w:r>
         <w:t>Distribution des données</w:t>
       </w:r>
@@ -2933,7 +3003,7 @@
         <w:pStyle w:val="Lgende"/>
         <w:jc w:val="center"/>
       </w:pPr>
-      <w:bookmarkStart w:id="7" w:name="_Toc229495744"/>
+      <w:bookmarkStart w:id="7" w:name="_Toc229755582"/>
       <w:r>
         <w:t xml:space="preserve">Figure </w:t>
       </w:r>
@@ -3034,7 +3104,7 @@
           <w:numId w:val="2"/>
         </w:numPr>
       </w:pPr>
-      <w:bookmarkStart w:id="8" w:name="_Toc229495739"/>
+      <w:bookmarkStart w:id="8" w:name="_Toc229755577"/>
       <w:r>
         <w:lastRenderedPageBreak/>
         <w:t>Dimensions des données</w:t>
@@ -3064,7 +3134,7 @@
           <w:noProof/>
         </w:rPr>
         <w:drawing>
-          <wp:inline distT="0" distB="0" distL="0" distR="0" wp14:anchorId="575AAC8C" wp14:editId="312805FC">
+          <wp:inline distT="0" distB="0" distL="0" distR="0" wp14:anchorId="575AAC8C" wp14:editId="5777078B">
             <wp:extent cx="2657050" cy="2653684"/>
             <wp:effectExtent l="0" t="0" r="0" b="0"/>
             <wp:docPr id="1124494066" name="Image 1"/>
@@ -3113,7 +3183,7 @@
           <w:noProof/>
         </w:rPr>
         <w:drawing>
-          <wp:inline distT="0" distB="0" distL="0" distR="0" wp14:anchorId="1230A6DF" wp14:editId="037B6D98">
+          <wp:inline distT="0" distB="0" distL="0" distR="0" wp14:anchorId="1230A6DF" wp14:editId="725C3C02">
             <wp:extent cx="2652918" cy="2646200"/>
             <wp:effectExtent l="0" t="0" r="0" b="1905"/>
             <wp:docPr id="804197506" name="Image 1"/>
@@ -3160,7 +3230,7 @@
         <w:pStyle w:val="Lgende"/>
         <w:jc w:val="center"/>
       </w:pPr>
-      <w:bookmarkStart w:id="9" w:name="_Toc229495745"/>
+      <w:bookmarkStart w:id="9" w:name="_Toc229755583"/>
       <w:r>
         <w:t xml:space="preserve">Figure </w:t>
       </w:r>
@@ -3263,7 +3333,7 @@
           <w:numId w:val="2"/>
         </w:numPr>
       </w:pPr>
-      <w:bookmarkStart w:id="10" w:name="_Toc229495740"/>
+      <w:bookmarkStart w:id="10" w:name="_Toc229755578"/>
       <w:r>
         <w:t>Aperçu des données</w:t>
       </w:r>
@@ -3358,7 +3428,7 @@
         <w:pStyle w:val="Lgende"/>
         <w:jc w:val="center"/>
       </w:pPr>
-      <w:bookmarkStart w:id="11" w:name="_Toc229495746"/>
+      <w:bookmarkStart w:id="11" w:name="_Toc229755584"/>
       <w:r>
         <w:t xml:space="preserve">Figure </w:t>
       </w:r>
@@ -3381,10 +3451,7 @@
         <w:fldChar w:fldCharType="end"/>
       </w:r>
       <w:r>
-        <w:t xml:space="preserve">: </w:t>
-      </w:r>
-      <w:r>
-        <w:t>Echantillon de données de la classe Normal</w:t>
+        <w:t>: Echantillon de données de la classe Normal</w:t>
       </w:r>
       <w:bookmarkEnd w:id="11"/>
     </w:p>
@@ -3444,7 +3511,7 @@
         <w:pStyle w:val="Lgende"/>
         <w:jc w:val="center"/>
       </w:pPr>
-      <w:bookmarkStart w:id="12" w:name="_Toc229495747"/>
+      <w:bookmarkStart w:id="12" w:name="_Toc229755585"/>
       <w:r>
         <w:t xml:space="preserve">Figure </w:t>
       </w:r>
@@ -3467,10 +3534,7 @@
         <w:fldChar w:fldCharType="end"/>
       </w:r>
       <w:r>
-        <w:t xml:space="preserve">: Echantillon de données de la classe </w:t>
-      </w:r>
-      <w:r>
-        <w:t>COVID</w:t>
+        <w:t>: Echantillon de données de la classe COVID</w:t>
       </w:r>
       <w:bookmarkEnd w:id="12"/>
     </w:p>
@@ -3531,7 +3595,7 @@
         <w:pStyle w:val="Lgende"/>
         <w:jc w:val="center"/>
       </w:pPr>
-      <w:bookmarkStart w:id="13" w:name="_Toc229495748"/>
+      <w:bookmarkStart w:id="13" w:name="_Toc229755586"/>
       <w:r>
         <w:t xml:space="preserve">Figure </w:t>
       </w:r>
@@ -3554,10 +3618,7 @@
         <w:fldChar w:fldCharType="end"/>
       </w:r>
       <w:r>
-        <w:t xml:space="preserve">: Echantillon de données de la classe </w:t>
-      </w:r>
-      <w:r>
-        <w:t xml:space="preserve">Lung </w:t>
+        <w:t xml:space="preserve">: Echantillon de données de la classe Lung </w:t>
       </w:r>
       <w:proofErr w:type="spellStart"/>
       <w:r>
@@ -3622,7 +3683,7 @@
         <w:pStyle w:val="Lgende"/>
         <w:jc w:val="center"/>
       </w:pPr>
-      <w:bookmarkStart w:id="14" w:name="_Toc229495749"/>
+      <w:bookmarkStart w:id="14" w:name="_Toc229755587"/>
       <w:r>
         <w:t xml:space="preserve">Figure </w:t>
       </w:r>
@@ -3645,10 +3706,7 @@
         <w:fldChar w:fldCharType="end"/>
       </w:r>
       <w:r>
-        <w:t xml:space="preserve">: Echantillon de données de la classe </w:t>
-      </w:r>
-      <w:r>
-        <w:t xml:space="preserve">Viral </w:t>
+        <w:t xml:space="preserve">: Echantillon de données de la classe Viral </w:t>
       </w:r>
       <w:proofErr w:type="spellStart"/>
       <w:r>
@@ -3717,15 +3775,9 @@
           <w:numId w:val="2"/>
         </w:numPr>
       </w:pPr>
-      <w:bookmarkStart w:id="15" w:name="_Toc229495741"/>
-      <w:r>
-        <w:t>Analyse</w:t>
-      </w:r>
-      <w:r>
-        <w:t xml:space="preserve"> des </w:t>
-      </w:r>
-      <w:r>
-        <w:t>intensités de pixels</w:t>
+      <w:bookmarkStart w:id="15" w:name="_Toc229755579"/>
+      <w:r>
+        <w:t>Analyse des intensités de pixels</w:t>
       </w:r>
       <w:bookmarkEnd w:id="15"/>
     </w:p>
@@ -3790,7 +3842,7 @@
         <w:pStyle w:val="Lgende"/>
         <w:jc w:val="center"/>
       </w:pPr>
-      <w:bookmarkStart w:id="16" w:name="_Toc229495750"/>
+      <w:bookmarkStart w:id="16" w:name="_Toc229755588"/>
       <w:r>
         <w:t xml:space="preserve">Figure </w:t>
       </w:r>
@@ -3813,10 +3865,7 @@
         <w:fldChar w:fldCharType="end"/>
       </w:r>
       <w:r>
-        <w:t xml:space="preserve">: Distributions </w:t>
-      </w:r>
-      <w:r>
-        <w:t>des moyennes d’intensités de pixel par image</w:t>
+        <w:t>: Distributions des moyennes d’intensités de pixel par image</w:t>
       </w:r>
       <w:bookmarkEnd w:id="16"/>
     </w:p>
@@ -3889,19 +3938,13 @@
     </w:p>
     <w:p>
       <w:r>
-        <w:t xml:space="preserve">Nous pouvons observer ci-dessous les distributions, par classe, des </w:t>
-      </w:r>
-      <w:r>
-        <w:t>écart</w:t>
+        <w:t>Nous pouvons observer ci-dessous les distributions, par classe, des écart</w:t>
       </w:r>
       <w:r>
         <w:t>s</w:t>
       </w:r>
       <w:r>
-        <w:t>-types</w:t>
-      </w:r>
-      <w:r>
-        <w:t xml:space="preserve"> d’intensités de pixels par image.</w:t>
+        <w:t>-types d’intensités de pixels par image.</w:t>
       </w:r>
     </w:p>
     <w:p>
@@ -3960,7 +4003,7 @@
         <w:pStyle w:val="Lgende"/>
         <w:jc w:val="center"/>
       </w:pPr>
-      <w:bookmarkStart w:id="17" w:name="_Toc229495751"/>
+      <w:bookmarkStart w:id="17" w:name="_Toc229755589"/>
       <w:r>
         <w:t xml:space="preserve">Figure </w:t>
       </w:r>
@@ -3983,19 +4026,13 @@
         <w:fldChar w:fldCharType="end"/>
       </w:r>
       <w:r>
-        <w:t xml:space="preserve">: Distributions des </w:t>
-      </w:r>
-      <w:r>
-        <w:t>écart</w:t>
+        <w:t>: Distributions des écart</w:t>
       </w:r>
       <w:r>
         <w:t>s</w:t>
       </w:r>
       <w:r>
-        <w:t>-types</w:t>
-      </w:r>
-      <w:r>
-        <w:t xml:space="preserve"> d’intensités de pixel par image</w:t>
+        <w:t>-types d’intensités de pixel par image</w:t>
       </w:r>
       <w:bookmarkEnd w:id="17"/>
     </w:p>
@@ -4043,7 +4080,7 @@
           <w:numId w:val="2"/>
         </w:numPr>
       </w:pPr>
-      <w:bookmarkStart w:id="18" w:name="_Toc229495742"/>
+      <w:bookmarkStart w:id="18" w:name="_Toc229755580"/>
       <w:r>
         <w:t>Données extrêmes</w:t>
       </w:r>
@@ -4119,7 +4156,7 @@
         <w:pStyle w:val="Lgende"/>
         <w:jc w:val="center"/>
       </w:pPr>
-      <w:bookmarkStart w:id="19" w:name="_Toc229495752"/>
+      <w:bookmarkStart w:id="19" w:name="_Toc229755590"/>
       <w:r>
         <w:t xml:space="preserve">Figure </w:t>
       </w:r>
@@ -4142,10 +4179,7 @@
         <w:fldChar w:fldCharType="end"/>
       </w:r>
       <w:r>
-        <w:t xml:space="preserve">: </w:t>
-      </w:r>
-      <w:r>
-        <w:t>Images les plus sombres (moyenne de pixels faible)</w:t>
+        <w:t>: Images les plus sombres (moyenne de pixels faible)</w:t>
       </w:r>
       <w:bookmarkEnd w:id="19"/>
     </w:p>
@@ -4240,7 +4274,7 @@
         <w:pStyle w:val="Lgende"/>
         <w:jc w:val="center"/>
       </w:pPr>
-      <w:bookmarkStart w:id="20" w:name="_Toc229495753"/>
+      <w:bookmarkStart w:id="20" w:name="_Toc229755591"/>
       <w:r>
         <w:t xml:space="preserve">Figure </w:t>
       </w:r>
@@ -4263,19 +4297,7 @@
         <w:fldChar w:fldCharType="end"/>
       </w:r>
       <w:r>
-        <w:t xml:space="preserve">: Images les plus </w:t>
-      </w:r>
-      <w:r>
-        <w:t>claires</w:t>
-      </w:r>
-      <w:r>
-        <w:t xml:space="preserve"> (moyenne de pixels </w:t>
-      </w:r>
-      <w:r>
-        <w:t>élevée</w:t>
-      </w:r>
-      <w:r>
-        <w:t>)</w:t>
+        <w:t>: Images les plus claires (moyenne de pixels élevée)</w:t>
       </w:r>
       <w:bookmarkEnd w:id="20"/>
     </w:p>
@@ -4372,7 +4394,7 @@
         <w:pStyle w:val="Lgende"/>
         <w:jc w:val="center"/>
       </w:pPr>
-      <w:bookmarkStart w:id="21" w:name="_Toc229495754"/>
+      <w:bookmarkStart w:id="21" w:name="_Toc229755592"/>
       <w:r>
         <w:t xml:space="preserve">Figure </w:t>
       </w:r>
@@ -4395,19 +4417,7 @@
         <w:fldChar w:fldCharType="end"/>
       </w:r>
       <w:r>
-        <w:t xml:space="preserve">: Images les </w:t>
-      </w:r>
-      <w:r>
-        <w:t>moins contrastées</w:t>
-      </w:r>
-      <w:r>
-        <w:t xml:space="preserve"> (</w:t>
-      </w:r>
-      <w:r>
-        <w:t>écart-type</w:t>
-      </w:r>
-      <w:r>
-        <w:t xml:space="preserve"> de pixels faible)</w:t>
+        <w:t>: Images les moins contrastées (écart-type de pixels faible)</w:t>
       </w:r>
       <w:bookmarkEnd w:id="21"/>
     </w:p>
@@ -4451,90 +4461,260 @@
           <w:numId w:val="2"/>
         </w:numPr>
       </w:pPr>
-      <w:bookmarkStart w:id="22" w:name="_Toc229495743"/>
+      <w:bookmarkStart w:id="22" w:name="_Toc229755581"/>
       <w:r>
         <w:t>Pré-traitement des données</w:t>
       </w:r>
       <w:bookmarkEnd w:id="22"/>
     </w:p>
-    <w:p/>
     <w:p>
       <w:pPr>
         <w:spacing w:after="0"/>
+        <w:jc w:val="both"/>
+      </w:pPr>
+      <w:r>
+        <w:t xml:space="preserve">Le prétraitement des données constitue une étape essentielle du projet afin d’homogénéiser les radiographies pulmonaires et de réduire les variations liées aux conditions d’acquisition des images. Dans un premier temps, l’ensemble des radiographies a été converti en niveaux de gris et redimensionné à une taille unique de 299×299 pixels. Cette homogénéisation des dimensions permet de garantir la compatibilité des données avec les modèles de machine </w:t>
+      </w:r>
+      <w:proofErr w:type="spellStart"/>
+      <w:r>
+        <w:t>learning</w:t>
+      </w:r>
+      <w:proofErr w:type="spellEnd"/>
+      <w:r>
+        <w:t xml:space="preserve"> et de </w:t>
+      </w:r>
+      <w:proofErr w:type="spellStart"/>
+      <w:r>
+        <w:t>deep</w:t>
+      </w:r>
+      <w:proofErr w:type="spellEnd"/>
+      <w:r>
+        <w:t xml:space="preserve"> </w:t>
+      </w:r>
+      <w:proofErr w:type="spellStart"/>
+      <w:r>
+        <w:t>learning</w:t>
+      </w:r>
+      <w:proofErr w:type="spellEnd"/>
+      <w:r>
+        <w:t xml:space="preserve"> utilisés par la suite. Les images ont également été converties au format float32 afin de faciliter les opérations numériques et les étapes de normalisation.</w:t>
+      </w:r>
+    </w:p>
+    <w:p>
+      <w:pPr>
+        <w:spacing w:after="0"/>
+        <w:jc w:val="both"/>
+      </w:pPr>
+      <w:r>
+        <w:lastRenderedPageBreak/>
+        <w:t xml:space="preserve">Les masques pulmonaires fournis avec le </w:t>
+      </w:r>
+      <w:proofErr w:type="spellStart"/>
+      <w:r>
+        <w:t>dataset</w:t>
+      </w:r>
+      <w:proofErr w:type="spellEnd"/>
+      <w:r>
+        <w:t xml:space="preserve"> ont ensuite été prétraités de manière similaire. Initialement stockés au format 256×256×3, ils ont été convertis en niveaux de gris puis redimensionnés en 299×299 pixels à l’aide d’une interpolation adaptée aux données binaires. Une binarisation des masques a ensuite été appliquée afin d’obtenir des régions pulmonaires clairement définies.</w:t>
+      </w:r>
+    </w:p>
+    <w:p>
+      <w:pPr>
+        <w:spacing w:after="0"/>
+        <w:jc w:val="both"/>
+      </w:pPr>
+      <w:r>
+        <w:t>Une amélioration du contraste a ensuite été réalisée sur les radiographies à l’aide de la méthode CLAHE (</w:t>
+      </w:r>
+      <w:proofErr w:type="spellStart"/>
+      <w:r>
+        <w:t>Contrast</w:t>
+      </w:r>
+      <w:proofErr w:type="spellEnd"/>
+      <w:r>
+        <w:t xml:space="preserve"> Limited Adaptive </w:t>
+      </w:r>
+      <w:proofErr w:type="spellStart"/>
+      <w:r>
+        <w:t>Histogram</w:t>
+      </w:r>
+      <w:proofErr w:type="spellEnd"/>
+      <w:r>
+        <w:t xml:space="preserve"> </w:t>
+      </w:r>
+      <w:proofErr w:type="spellStart"/>
+      <w:r>
+        <w:t>Equalization</w:t>
+      </w:r>
+      <w:proofErr w:type="spellEnd"/>
+      <w:r>
+        <w:t>). Cette technique permet d’augmenter localement le contraste des images tout en limitant l’amplification excessive du bruit. Son utilisation est particulièrement adaptée aux radiographies pulmonaires, où certaines anomalies peuvent présenter de faibles variations d’intensité difficiles à distinguer sur les images originales.</w:t>
+      </w:r>
+    </w:p>
+    <w:p>
+      <w:pPr>
+        <w:spacing w:after="0"/>
+        <w:jc w:val="both"/>
+      </w:pPr>
+      <w:r>
+        <w:t>Les masques pulmonaires ont ensuite été appliqués aux radiographies afin d’isoler uniquement les régions des poumons. Cette étape permet de supprimer une grande partie des zones non pertinentes présentes dans les images, telles que le fond noir, certaines annotations ou des artefacts externes. L’objectif est ainsi de concentrer l’apprentissage des modèles sur les régions anatomiques réellement utiles au diagnostic.</w:t>
+      </w:r>
+    </w:p>
+    <w:p>
+      <w:pPr>
+        <w:spacing w:after="0"/>
+        <w:jc w:val="both"/>
+      </w:pPr>
+      <w:r>
+        <w:t>Les images prétraitées ont ensuite été sauvegardées dans un nouveau répertoire afin d’être utilisées dans les étapes de modélisation et d’entraînement des modèles.</w:t>
+      </w:r>
+    </w:p>
+    <w:p>
+      <w:pPr>
+        <w:spacing w:after="0"/>
+        <w:jc w:val="both"/>
+      </w:pPr>
+      <w:r>
+        <w:t xml:space="preserve">Nous pouvons observer ci-dessous quelques échantillons des images ainsi </w:t>
+      </w:r>
+      <w:proofErr w:type="spellStart"/>
+      <w:r>
+        <w:t>pré-traitées</w:t>
+      </w:r>
+      <w:proofErr w:type="spellEnd"/>
+      <w:r>
+        <w:t>.</w:t>
+      </w:r>
+    </w:p>
+    <w:p>
+      <w:pPr>
+        <w:jc w:val="center"/>
+      </w:pPr>
+      <w:r>
+        <w:rPr>
+          <w:noProof/>
+        </w:rPr>
+        <w:drawing>
+          <wp:inline distT="0" distB="0" distL="0" distR="0" wp14:anchorId="1BF6262C" wp14:editId="12FE50A2">
+            <wp:extent cx="5760720" cy="4419862"/>
+            <wp:effectExtent l="0" t="0" r="0" b="0"/>
+            <wp:docPr id="536259808" name="Image 1"/>
+            <wp:cNvGraphicFramePr>
+              <a:graphicFrameLocks xmlns:a="http://schemas.openxmlformats.org/drawingml/2006/main" noChangeAspect="1"/>
+            </wp:cNvGraphicFramePr>
+            <a:graphic xmlns:a="http://schemas.openxmlformats.org/drawingml/2006/main">
+              <a:graphicData uri="http://schemas.openxmlformats.org/drawingml/2006/picture">
+                <pic:pic xmlns:pic="http://schemas.openxmlformats.org/drawingml/2006/picture">
+                  <pic:nvPicPr>
+                    <pic:cNvPr id="536259808" name="Image 1"/>
+                    <pic:cNvPicPr/>
+                  </pic:nvPicPr>
+                  <pic:blipFill>
+                    <a:blip r:embed="rId19">
+                      <a:extLst>
+                        <a:ext uri="{28A0092B-C50C-407E-A947-70E740481C1C}">
+                          <a14:useLocalDpi xmlns:a14="http://schemas.microsoft.com/office/drawing/2010/main" val="0"/>
+                        </a:ext>
+                      </a:extLst>
+                    </a:blip>
+                    <a:stretch>
+                      <a:fillRect/>
+                    </a:stretch>
+                  </pic:blipFill>
+                  <pic:spPr>
+                    <a:xfrm>
+                      <a:off x="0" y="0"/>
+                      <a:ext cx="5760720" cy="4419862"/>
+                    </a:xfrm>
+                    <a:prstGeom prst="rect">
+                      <a:avLst/>
+                    </a:prstGeom>
+                  </pic:spPr>
+                </pic:pic>
+              </a:graphicData>
+            </a:graphic>
+          </wp:inline>
+        </w:drawing>
+      </w:r>
+    </w:p>
+    <w:p>
+      <w:pPr>
+        <w:pStyle w:val="Lgende"/>
+        <w:jc w:val="center"/>
+      </w:pPr>
+      <w:bookmarkStart w:id="23" w:name="_Toc229755593"/>
+      <w:r>
+        <w:t xml:space="preserve">Figure </w:t>
+      </w:r>
+      <w:r>
+        <w:fldChar w:fldCharType="begin"/>
+      </w:r>
+      <w:r>
+        <w:instrText xml:space="preserve"> SEQ Figure \* ARABIC </w:instrText>
+      </w:r>
+      <w:r>
+        <w:fldChar w:fldCharType="separate"/>
+      </w:r>
+      <w:r>
+        <w:rPr>
+          <w:noProof/>
+        </w:rPr>
+        <w:t>12</w:t>
+      </w:r>
+      <w:r>
+        <w:fldChar w:fldCharType="end"/>
+      </w:r>
+      <w:r>
+        <w:t xml:space="preserve">: </w:t>
+      </w:r>
+      <w:r>
+        <w:t xml:space="preserve">Echantillon de données </w:t>
+      </w:r>
+      <w:proofErr w:type="spellStart"/>
+      <w:r>
+        <w:t>pré-traitées</w:t>
+      </w:r>
+      <w:bookmarkEnd w:id="23"/>
+      <w:proofErr w:type="spellEnd"/>
+    </w:p>
+    <w:p>
+      <w:pPr>
+        <w:jc w:val="both"/>
+      </w:pPr>
+      <w:r>
+        <w:lastRenderedPageBreak/>
+        <w:t xml:space="preserve">La normalisation finale des images ainsi que les opérations de data augmentation ne sont pas appliquées lors de la phase de prétraitement offline, mais directement au moment de l’entraînement des modèles. Cette approche dite </w:t>
+      </w:r>
+      <w:r>
+        <w:rPr>
+          <w:i/>
+          <w:iCs/>
+        </w:rPr>
+        <w:t>online</w:t>
+      </w:r>
+      <w:r>
+        <w:t xml:space="preserve"> permet d’appliquer dynamiquement les transformations à chaque chargement des données dans le pipeline d’apprentissage. La normalisation des intensités est ainsi réalisée juste avant l’entrée des images dans les modèles afin de garantir des distributions de données homogènes tout en conservant les images prétraitées sauvegardées dans un format standard exploitable. De la même manière, les opérations de data augmentation, telles que les rotations légères, translations, variations de luminosité ou modifications de contraste, sont générées aléatoirement à chaque époque d’entraînement. Cette stratégie permet d’augmenter artificiellement la diversité des données sans créer physiquement de nouvelles images sur disque, tout en réduisant le risque de surapprentissage. Elle offre également une plus grande flexibilité expérimentale pour ajuster les transformations utilisées selon les modèles évalués au cours du projet.</w:t>
+      </w:r>
+    </w:p>
+    <w:p>
+      <w:pPr>
+        <w:spacing w:after="0"/>
+        <w:jc w:val="both"/>
         <w:rPr>
           <w:sz w:val="32"/>
           <w:szCs w:val="32"/>
         </w:rPr>
       </w:pPr>
-      <w:r>
+    </w:p>
+    <w:p>
+      <w:pPr>
+        <w:spacing w:after="0"/>
+        <w:jc w:val="both"/>
         <w:rPr>
           <w:sz w:val="32"/>
           <w:szCs w:val="32"/>
         </w:rPr>
-        <w:t>- data augmentation</w:t>
-      </w:r>
-      <w:r>
-        <w:rPr>
-          <w:sz w:val="32"/>
-          <w:szCs w:val="32"/>
-        </w:rPr>
-        <w:t xml:space="preserve"> (flip, reverse, translate, …)</w:t>
-      </w:r>
-    </w:p>
-    <w:p>
-      <w:pPr>
-        <w:spacing w:after="0"/>
-        <w:rPr>
-          <w:sz w:val="32"/>
-          <w:szCs w:val="32"/>
-        </w:rPr>
-      </w:pPr>
-      <w:r>
-        <w:rPr>
-          <w:sz w:val="32"/>
-          <w:szCs w:val="32"/>
-        </w:rPr>
-        <w:t>- application des masques</w:t>
-      </w:r>
-    </w:p>
-    <w:p>
-      <w:pPr>
-        <w:spacing w:after="0"/>
-        <w:rPr>
-          <w:sz w:val="32"/>
-          <w:szCs w:val="32"/>
-        </w:rPr>
-      </w:pPr>
-      <w:r>
-        <w:rPr>
-          <w:sz w:val="32"/>
-          <w:szCs w:val="32"/>
-        </w:rPr>
-        <w:t>- augmentation des contrastes</w:t>
-      </w:r>
-      <w:r>
-        <w:rPr>
-          <w:sz w:val="32"/>
-          <w:szCs w:val="32"/>
-        </w:rPr>
-        <w:t xml:space="preserve"> (CLAHE)</w:t>
-      </w:r>
-    </w:p>
-    <w:p>
-      <w:pPr>
-        <w:spacing w:after="0"/>
-        <w:rPr>
-          <w:sz w:val="32"/>
-          <w:szCs w:val="32"/>
-        </w:rPr>
-      </w:pPr>
-      <w:r>
-        <w:rPr>
-          <w:sz w:val="32"/>
-          <w:szCs w:val="32"/>
-        </w:rPr>
-        <w:t>- filtrage et/ou opérations morpho</w:t>
-      </w:r>
+      </w:pPr>
     </w:p>
     <w:sectPr>
       <w:pgSz w:w="11906" w:h="16838"/>

</xml_diff>